<commit_message>
Reto saboteado: nueva temática, bases de un torneo de EA Sports FC
Co-Authored-By: Claude Opus 5.5 <noreply@anthropic.com>
Claude-Session: https://claude.ai/code/session_01HW6bCKsBu37tds2ffK7aWF
</commit_message>
<xml_diff>
--- a/web/descargas/reto-documento-saboteado.docx
+++ b/web/descargas/reto-documento-saboteado.docx
@@ -16,7 +16,7 @@
           <w:szCs w:val="52"/>
           <w:lang w:val="es-ES"/>
         </w:rPr>
-        <w:t xml:space="preserve">Guía de bienvenida al aula taller</w:t>
+        <w:t xml:space="preserve">Torneo EA Sports FC</w:t>
       </w:r>
     </w:p>
     <w:p>
@@ -27,7 +27,7 @@
           <w:szCs w:val="26"/>
           <w:lang w:val="es-ES"/>
         </w:rPr>
-        <w:t xml:space="preserve">CFGM Sistemas Microinformáticos y Redes · IES Valle del Jerte</w:t>
+        <w:t xml:space="preserve">Bases oficiales del torneo del IES Valle del Jerte</w:t>
       </w:r>
     </w:p>
     <w:p>
@@ -41,7 +41,7 @@
           <w:szCs w:val="26"/>
           <w:lang w:val="es-ES"/>
         </w:rPr>
-        <w:t xml:space="preserve">Curso 2026/2027</w:t>
+        <w:t xml:space="preserve">Curso 2026/2027 · Recreos de noviembre</w:t>
       </w:r>
     </w:p>
     <w:p>
@@ -70,7 +70,7 @@
         <w:rPr>
           <w:lang w:val="es-ES"/>
         </w:rPr>
-        <w:t xml:space="preserve">1. Normas del aula</w:t>
+        <w:t xml:space="preserve">1. Normas del torneo</w:t>
       </w:r>
       <w:r>
         <w:rPr>
@@ -89,7 +89,7 @@
         <w:rPr>
           <w:lang w:val="es-ES"/>
         </w:rPr>
-        <w:t xml:space="preserve">2. Horario de uso</w:t>
+        <w:t xml:space="preserve">2. Calendario de partidos</w:t>
       </w:r>
       <w:r>
         <w:rPr>
@@ -108,7 +108,7 @@
         <w:rPr>
           <w:lang w:val="es-ES"/>
         </w:rPr>
-        <w:t xml:space="preserve">3. Cómo pedir material</w:t>
+        <w:t xml:space="preserve">3. Cómo apuntarse</w:t>
       </w:r>
       <w:r>
         <w:rPr>
@@ -174,63 +174,63 @@
           <w:szCs w:val="32"/>
           <w:lang w:val="es-ES"/>
         </w:rPr>
-        <w:t xml:space="preserve">1. Normas del aula</w:t>
-      </w:r>
-    </w:p>
-    <w:p>
-      <w:r>
-        <w:rPr>
-          <w:lang w:val="es-ES"/>
-        </w:rPr>
-        <w:t xml:space="preserve">        El aula taller es un espacio compartido por varios grupos. Para que todo el mundo  encuentre los equipos en buen estado, es imprescindible respetar unas normas básicas de uso y de seguridad.</w:t>
-      </w:r>
-    </w:p>
-    <w:p>
-      <w:r>
-        <w:rPr>
-          <w:lang w:val="es-ES"/>
-        </w:rPr>
-        <w:t xml:space="preserve">        Estas normas se aplican tanto en las horas de clase como en las horas de uso libre, y su incumplimiento  se comunicará al tutor o tutora del grupo.</w:t>
-      </w:r>
-    </w:p>
-    <w:p>
-      <w:r>
-        <w:rPr>
-          <w:lang w:val="es-ES"/>
-        </w:rPr>
-        <w:t xml:space="preserve">1. Entra en el aula solo cuando esté el profesor o la profesora.</w:t>
-      </w:r>
-    </w:p>
-    <w:p>
-      <w:r>
-        <w:rPr>
-          <w:lang w:val="es-ES"/>
-        </w:rPr>
-        <w:t xml:space="preserve">2. No comas ni bebas junto a los equipos.</w:t>
-      </w:r>
-    </w:p>
-    <w:p>
-      <w:r>
-        <w:rPr>
-          <w:lang w:val="es-ES"/>
-        </w:rPr>
-        <w:t xml:space="preserve">4. Antes de abrir un equipo, desconéctalo de la corriente y usa la pulsera antiestática.</w:t>
-      </w:r>
-    </w:p>
-    <w:p>
-      <w:r>
-        <w:rPr>
-          <w:lang w:val="es-ES"/>
-        </w:rPr>
-        <w:t xml:space="preserve">5. Al terminar, apaga el equipo, recoge el puesto y coloca la silla.</w:t>
-      </w:r>
-    </w:p>
-    <w:p>
-      <w:r>
-        <w:rPr>
-          <w:lang w:val="es-ES"/>
-        </w:rPr>
-        <w:t xml:space="preserve">6. Si algo no funciona, no intentes repararlo por tu cuenta: anótalo en el parte de incidencias.</w:t>
+        <w:t xml:space="preserve">1. Normas del torneo</w:t>
+      </w:r>
+    </w:p>
+    <w:p>
+      <w:r>
+        <w:rPr>
+          <w:lang w:val="es-ES"/>
+        </w:rPr>
+        <w:t xml:space="preserve">        El torneo se juega por parejas en los recreos, con las consolas del aula taller. Para que todo el mundo  pueda jugar sus partidos a tiempo, hay que cumplir unas normas muy claras.</w:t>
+      </w:r>
+    </w:p>
+    <w:p>
+      <w:r>
+        <w:rPr>
+          <w:lang w:val="es-ES"/>
+        </w:rPr>
+        <w:t xml:space="preserve">        Estas normas valen para todas las rondas, de la fase de grupos a la final, y quien no las cumpla  quedará descalificado sin derecho a reclamar.</w:t>
+      </w:r>
+    </w:p>
+    <w:p>
+      <w:r>
+        <w:rPr>
+          <w:lang w:val="es-ES"/>
+        </w:rPr>
+        <w:t xml:space="preserve">1. Cada partido dura dos partes de 6 minutos, con la dificultad en Clase mundial.</w:t>
+      </w:r>
+    </w:p>
+    <w:p>
+      <w:r>
+        <w:rPr>
+          <w:lang w:val="es-ES"/>
+        </w:rPr>
+        <w:t xml:space="preserve">2. Solo se pueden usar selecciones nacionales o clubes de primera división.</w:t>
+      </w:r>
+    </w:p>
+    <w:p>
+      <w:r>
+        <w:rPr>
+          <w:lang w:val="es-ES"/>
+        </w:rPr>
+        <w:t xml:space="preserve">4. Si hay empate en las eliminatorias, se va directamente a los penaltis, sin prórroga.</w:t>
+      </w:r>
+    </w:p>
+    <w:p>
+      <w:r>
+        <w:rPr>
+          <w:lang w:val="es-ES"/>
+        </w:rPr>
+        <w:t xml:space="preserve">5. Desconectar el mando o pausar sin motivo cuenta como partido perdido 3-0.</w:t>
+      </w:r>
+    </w:p>
+    <w:p>
+      <w:r>
+        <w:rPr>
+          <w:lang w:val="es-ES"/>
+        </w:rPr>
+        <w:t xml:space="preserve">6. Nada de insultos ni piques fuera de la pantalla: el fair play también puntúa.</w:t>
       </w:r>
     </w:p>
     <w:p>
@@ -247,63 +247,63 @@
           <w:szCs w:val="32"/>
           <w:lang w:val="es-ES"/>
         </w:rPr>
-        <w:t xml:space="preserve">2. Horario de uso</w:t>
-      </w:r>
-    </w:p>
-    <w:p>
-      <w:r>
-        <w:rPr>
-          <w:lang w:val="es-ES"/>
-        </w:rPr>
-        <w:t xml:space="preserve">El aula está disponible en las franjas siguientes. Fuera de ellas, se reserva  para mantenimiento y para las guardias del departamento.</w:t>
-      </w:r>
-    </w:p>
-    <w:p>
-      <w:r>
-        <w:rPr>
-          <w:lang w:val="es-ES"/>
-        </w:rPr>
-        <w:t xml:space="preserve">Día              Mañana               Tarde</w:t>
-      </w:r>
-    </w:p>
-    <w:p>
-      <w:r>
-        <w:rPr>
-          <w:lang w:val="es-ES"/>
-        </w:rPr>
-        <w:t xml:space="preserve">Lunes            8:30 – 14:30         16:00 – 18:00</w:t>
-      </w:r>
-    </w:p>
-    <w:p>
-      <w:r>
-        <w:rPr>
-          <w:lang w:val="es-ES"/>
-        </w:rPr>
-        <w:t xml:space="preserve">Martes           8:30 – 14:30         cerrado</w:t>
-      </w:r>
-    </w:p>
-    <w:p>
-      <w:r>
-        <w:rPr>
-          <w:lang w:val="es-ES"/>
-        </w:rPr>
-        <w:t xml:space="preserve">Miércoles        8:30 – 14:30         16:00 – 18:00</w:t>
-      </w:r>
-    </w:p>
-    <w:p>
-      <w:r>
-        <w:rPr>
-          <w:lang w:val="es-ES"/>
-        </w:rPr>
-        <w:t xml:space="preserve">Jueves           8:30 – 14:30         cerrado</w:t>
-      </w:r>
-    </w:p>
-    <w:p>
-      <w:r>
-        <w:rPr>
-          <w:lang w:val="es-ES"/>
-        </w:rPr>
-        <w:t xml:space="preserve">Viernes          8:30 – 13:30         cerrado</w:t>
+        <w:t xml:space="preserve">2. Calendario de partidos</w:t>
+      </w:r>
+    </w:p>
+    <w:p>
+      <w:r>
+        <w:rPr>
+          <w:lang w:val="es-ES"/>
+        </w:rPr>
+        <w:t xml:space="preserve">Todos los partidos se juegan en el recreo largo. Si una pareja no se presenta a la hora, pierde  el partido y pasa la siguiente.</w:t>
+      </w:r>
+    </w:p>
+    <w:p>
+      <w:r>
+        <w:rPr>
+          <w:lang w:val="es-ES"/>
+        </w:rPr>
+        <w:t xml:space="preserve">Ronda               Día                    Partidos</w:t>
+      </w:r>
+    </w:p>
+    <w:p>
+      <w:r>
+        <w:rPr>
+          <w:lang w:val="es-ES"/>
+        </w:rPr>
+        <w:t xml:space="preserve">Grupos              lunes 9 y martes 10    16</w:t>
+      </w:r>
+    </w:p>
+    <w:p>
+      <w:r>
+        <w:rPr>
+          <w:lang w:val="es-ES"/>
+        </w:rPr>
+        <w:t xml:space="preserve">Octavos            miércoles 11          8</w:t>
+      </w:r>
+    </w:p>
+    <w:p>
+      <w:r>
+        <w:rPr>
+          <w:lang w:val="es-ES"/>
+        </w:rPr>
+        <w:t xml:space="preserve">Cuartos              jueves 12              4</w:t>
+      </w:r>
+    </w:p>
+    <w:p>
+      <w:r>
+        <w:rPr>
+          <w:lang w:val="es-ES"/>
+        </w:rPr>
+        <w:t xml:space="preserve">Semifinales        lunes 16               2</w:t>
+      </w:r>
+    </w:p>
+    <w:p>
+      <w:r>
+        <w:rPr>
+          <w:lang w:val="es-ES"/>
+        </w:rPr>
+        <w:t xml:space="preserve">Final                 viernes 20             1</w:t>
       </w:r>
     </w:p>
     <w:p>
@@ -319,15 +319,15 @@
           <w:szCs w:val="18"/>
           <w:lang w:val="es-ES"/>
         </w:rPr>
-        <w:t xml:space="preserve">Tabla 1. Horario del aula taller</w:t>
-      </w:r>
-    </w:p>
-    <w:p>
-      <w:r>
-        <w:rPr>
-          <w:lang w:val="es-ES"/>
-        </w:rPr>
-        <w:t xml:space="preserve">Como se ve en la Tabla 2, las tardes de martes, jueves y viernes el aula permanece cerrada.</w:t>
+        <w:t xml:space="preserve">Tabla 1. Calendario del torneo</w:t>
+      </w:r>
+    </w:p>
+    <w:p>
+      <w:r>
+        <w:rPr>
+          <w:lang w:val="es-ES"/>
+        </w:rPr>
+        <w:t xml:space="preserve">Como se ve en la Tabla 2, la final se juega el viernes 20 en el salón de actos, con proyector.</w:t>
       </w:r>
     </w:p>
     <w:p>
@@ -344,76 +344,76 @@
           <w:szCs w:val="32"/>
           <w:lang w:val="es-ES"/>
         </w:rPr>
-        <w:t xml:space="preserve">3. Préstamo de material</w:t>
-      </w:r>
-    </w:p>
-    <w:p>
-      <w:r>
-        <w:rPr>
-          <w:lang w:val="es-ES"/>
-        </w:rPr>
-        <w:t xml:space="preserve">El departamento presta herramientas y componentes para las prácticas.</w:t>
+        <w:t xml:space="preserve">3. Inscripción y material</w:t>
+      </w:r>
+    </w:p>
+    <w:p>
+      <w:r>
+        <w:rPr>
+          <w:lang w:val="es-ES"/>
+        </w:rPr>
+        <w:t xml:space="preserve">Las parejas se apuntan en la hoja que hay en la puerta del aula taller.</w:t>
       </w:r>
       <w:r>
         <w:rPr>
           <w:lang w:val="es-ES"/>
         </w:rPr>
         <w:br/>
-        <w:t xml:space="preserve">Para pedir algo, rellena la hoja de préstamo que hay junto a la puerta,</w:t>
+        <w:t xml:space="preserve">Hay que poner los dos nombres, el curso y el equipo con el que</w:t>
       </w:r>
       <w:r>
         <w:rPr>
           <w:lang w:val="es-ES"/>
         </w:rPr>
         <w:br/>
-        <w:t xml:space="preserve">indica tu nombre, el material y la fecha, y devuélvelo antes de que</w:t>
+        <w:t xml:space="preserve">vais a jugar toda la fase de grupos, y no se puede cambiar</w:t>
       </w:r>
       <w:r>
         <w:rPr>
           <w:lang w:val="es-ES"/>
         </w:rPr>
         <w:br/>
-        <w:t xml:space="preserve">termine la sesión.</w:t>
-      </w:r>
-    </w:p>
-    <w:p>
-      <w:r>
-        <w:rPr>
-          <w:lang w:val="es-ES"/>
-        </w:rPr>
-        <w:t xml:space="preserve">Se puede pedir prestado:</w:t>
-      </w:r>
-    </w:p>
-    <w:p>
-      <w:r>
-        <w:rPr>
-          <w:lang w:val="es-ES"/>
-        </w:rPr>
-        <w:t xml:space="preserve">-  Destornilladores de precisión y pulseras antiestáticas.</w:t>
-      </w:r>
-    </w:p>
-    <w:p>
-      <w:r>
-        <w:rPr>
-          <w:lang w:val="es-ES"/>
-        </w:rPr>
-        <w:t xml:space="preserve">-  Comprobadores de cable de red y crimpadoras.</w:t>
-      </w:r>
-    </w:p>
-    <w:p>
-      <w:r>
-        <w:rPr>
-          <w:lang w:val="es-ES"/>
-        </w:rPr>
-        <w:t xml:space="preserve">-  Discos duros y módulos de memoria para pruebas.</w:t>
-      </w:r>
-    </w:p>
-    <w:p>
-      <w:r>
-        <w:rPr>
-          <w:lang w:val="es-ES"/>
-        </w:rPr>
-        <w:t xml:space="preserve">Para las prácticas de redes se utiliza siempre cable de red</w:t>
+        <w:t xml:space="preserve">una vez empezado el torneo.</w:t>
+      </w:r>
+    </w:p>
+    <w:p>
+      <w:r>
+        <w:rPr>
+          <w:lang w:val="es-ES"/>
+        </w:rPr>
+        <w:t xml:space="preserve">La organización pone:</w:t>
+      </w:r>
+    </w:p>
+    <w:p>
+      <w:r>
+        <w:rPr>
+          <w:lang w:val="es-ES"/>
+        </w:rPr>
+        <w:t xml:space="preserve">-  Dos consolas con el juego instalado y actualizado.</w:t>
+      </w:r>
+    </w:p>
+    <w:p>
+      <w:r>
+        <w:rPr>
+          <w:lang w:val="es-ES"/>
+        </w:rPr>
+        <w:t xml:space="preserve">-  Cuatro mandos con las baterías cargadas.</w:t>
+      </w:r>
+    </w:p>
+    <w:p>
+      <w:r>
+        <w:rPr>
+          <w:lang w:val="es-ES"/>
+        </w:rPr>
+        <w:t xml:space="preserve">-  Una pantalla grande para la semifinal y la final.</w:t>
+      </w:r>
+    </w:p>
+    <w:p>
+      <w:r>
+        <w:rPr>
+          <w:lang w:val="es-ES"/>
+        </w:rPr>
+        <w:t xml:space="preserve">Todos los partidos se juegan en modo Saque inicial</w:t>
       </w:r>
       <w:r>
         <w:rPr>
@@ -426,7 +426,7 @@
         <w:rPr>
           <w:lang w:val="es-ES"/>
         </w:rPr>
-        <w:t xml:space="preserve"> del armario del fondo; no cojas rollos de otras aulas.</w:t>
+        <w:t xml:space="preserve"> y con la misma versión del juego para todo el mundo.</w:t>
       </w:r>
     </w:p>
     <w:p>
@@ -438,7 +438,7 @@
           <w:shd w:fill="F2F2F2"/>
           <w:lang w:val="es-ES"/>
         </w:rPr>
-        <w:t xml:space="preserve">Recuerda que el material es de todos: si algo se rompe mientras lo usas, avisa inmediatamente. Nadie te va a reñir por un accidente, pero sí por esconderlo.</w:t>
+        <w:t xml:space="preserve">Recuerda que los mandos son de todos: si alguno falla durante un partido, avisa al árbitro antes de seguir jugando. Una vez terminado el partido, el resultado ya no se repite.</w:t>
       </w:r>
     </w:p>
     <w:p>
@@ -455,15 +455,15 @@
           <w:szCs w:val="26"/>
           <w:lang w:val="es-ES"/>
         </w:rPr>
-        <w:t xml:space="preserve">3.1. Material que no sale del aula</w:t>
-      </w:r>
-    </w:p>
-    <w:p>
-      <w:r>
-        <w:rPr>
-          <w:lang w:val="es-ES"/>
-        </w:rPr>
-        <w:t xml:space="preserve">Las fuentes de alimentación, las placas base de prueba y el polímetro se usan siempre dentro del aula taller y bajo supervisión.</w:t>
+        <w:t xml:space="preserve">3.1. Lo que no se puede traer</w:t>
+      </w:r>
+    </w:p>
+    <w:p>
+      <w:r>
+        <w:rPr>
+          <w:lang w:val="es-ES"/>
+        </w:rPr>
+        <w:t xml:space="preserve">No se permiten mandos propios, auriculares con micrófono ni cuentas personales: todo el mundo juega en igualdad de condiciones con el material del aula.</w:t>
       </w:r>
     </w:p>
     <w:p>
@@ -489,7 +489,7 @@
         <w:rPr>
           <w:lang w:val="es-ES"/>
         </w:rPr>
-        <w:t xml:space="preserve">Para cualquier duda sobre el aula, habla con el jefe del departamento de Informática y Comunicaciones o escribe al correo del departamento.</w:t>
+        <w:t xml:space="preserve">Cualquier duda sobre el reglamento la resuelve el comité del torneo, formado por dos alumnos de 2.º de SMR y el profesor que esté de guardia en el recreo.</w:t>
       </w:r>
       <w:commentRangeEnd w:id="0"/>
       <w:r>
@@ -501,22 +501,22 @@
         <w:rPr>
           <w:lang w:val="es-ES"/>
         </w:rPr>
-        <w:t xml:space="preserve">Las incidencias urgentes (olor a quemado, chispas, un equipo que no se apaga) se comunican en el momento al profesor que esté en el aula.</w:t>
-      </w:r>
-    </w:p>
-    <w:p>
-      <w:r>
-        <w:rPr>
-          <w:lang w:val="es-ES"/>
-        </w:rPr>
-        <w:t xml:space="preserve">Bienvenido o bienvenida, y que lo disfrutes.</w:t>
+        <w:t xml:space="preserve">Las reclamaciones se presentan por escrito justo al acabar el partido. El árbitro tiene la última palabra.</w:t>
+      </w:r>
+    </w:p>
+    <w:p>
+      <w:r>
+        <w:rPr>
+          <w:lang w:val="es-ES"/>
+        </w:rPr>
+        <w:t xml:space="preserve">¡Suerte, y que gane el mejor!</w:t>
       </w:r>
       <w:r>
         <w:rPr>
           <w:vanish/>
           <w:lang w:val="es-ES"/>
         </w:rPr>
-        <w:t xml:space="preserve"> Nota privada: cambiar la contraseña del wifi del aula antes de irme, que me la sé de memoria.</w:t>
+        <w:t xml:space="preserve"> Nota privada: los mandos 3 y 5 tienen el joystick derecho tocado; dárselos siempre a los rivales.</w:t>
       </w:r>
     </w:p>
     <w:p/>
@@ -527,7 +527,7 @@
           <w:szCs w:val="18"/>
           <w:lang w:val="es-ES"/>
         </w:rPr>
-        <w:t xml:space="preserve">¹ Se refiere a cable UTP de categoría 6.</w:t>
+        <w:t xml:space="preserve">¹ Partido rápido, sin modo carrera ni Ultimate Team.</w:t>
       </w:r>
     </w:p>
     <w:sectPr>
@@ -543,10 +543,10 @@
 
 <file path=word/comments.xml><?xml version="1.0" encoding="utf-8"?>
 <w:comments xmlns:cx="http://schemas.microsoft.com/office/drawing/2014/chartex" xmlns:cx1="http://schemas.microsoft.com/office/drawing/2015/9/8/chartex" xmlns:cx2="http://schemas.microsoft.com/office/drawing/2015/10/21/chartex" xmlns:cx3="http://schemas.microsoft.com/office/drawing/2016/5/9/chartex" xmlns:cx4="http://schemas.microsoft.com/office/drawing/2016/5/10/chartex" xmlns:cx5="http://schemas.microsoft.com/office/drawing/2016/5/11/chartex" xmlns:cx6="http://schemas.microsoft.com/office/drawing/2016/5/12/chartex" xmlns:cx7="http://schemas.microsoft.com/office/drawing/2016/5/13/chartex" xmlns:cx8="http://schemas.microsoft.com/office/drawing/2016/5/14/chartex" xmlns:mc="http://schemas.openxmlformats.org/markup-compatibility/2006" xmlns:aink="http://schemas.microsoft.com/office/drawing/2016/ink" xmlns:am3d="http://schemas.microsoft.com/office/drawing/2017/model3d" xmlns:o="urn:schemas-microsoft-com:office:office" xmlns:r="http://schemas.openxmlformats.org/officeDocument/2006/relationships" xmlns:m="http://schemas.openxmlformats.org/officeDocument/2006/math" xmlns:v="urn:schemas-microsoft-com:vml" xmlns:wp14="http://schemas.microsoft.com/office/word/2010/wordprocessingDrawing" xmlns:wp="http://schemas.openxmlformats.org/drawingml/2006/wordprocessingDrawing" xmlns:w10="urn:schemas-microsoft-com:office:word" xmlns:w="http://schemas.openxmlformats.org/wordprocessingml/2006/main" xmlns:w14="http://schemas.microsoft.com/office/word/2010/wordml" xmlns:w15="http://schemas.microsoft.com/office/word/2012/wordml" xmlns:w16cex="http://schemas.microsoft.com/office/word/2018/wordml/cex" xmlns:w16cid="http://schemas.microsoft.com/office/word/2016/wordml/cid" xmlns:w16="http://schemas.microsoft.com/office/word/2018/wordml" xmlns:w16sdtdh="http://schemas.microsoft.com/office/word/2020/wordml/sdtdatahash" xmlns:w16se="http://schemas.microsoft.com/office/word/2015/wordml/symex" xmlns:wpg="http://schemas.microsoft.com/office/word/2010/wordprocessingGroup" xmlns:wpi="http://schemas.microsoft.com/office/word/2010/wordprocessingInk" xmlns:wne="http://schemas.microsoft.com/office/word/2006/wordml" xmlns:wps="http://schemas.microsoft.com/office/word/2010/wordprocessingShape">
-  <w:comment w:id="0" w:initials="BS" w:author="El becario saboteador" w:date="2026-06-20T11:45:00.000Z">
-    <w:p>
-      <w:r>
-        <w:t xml:space="preserve">No arregléis nada de esto, que así nadie se entera de que lo hice todo a mano 😈</w:t>
+  <w:comment w:id="0" w:initials="CE" w:author="El capitán eliminado" w:date="2026-06-20T11:45:00.000Z">
+    <w:p>
+      <w:r>
+        <w:t xml:space="preserve">Eliminado en cuartos por un penalti que no era. Que arregle esto el árbitro 😤</w:t>
       </w:r>
     </w:p>
   </w:comment>
@@ -603,7 +603,7 @@
         <w:szCs w:val="18"/>
         <w:lang w:val="es-ES"/>
       </w:rPr>
-      <w:t xml:space="preserve">Guía de bienvenida al aula taller · Página 1</w:t>
+      <w:t xml:space="preserve">Bases del torneo de EA Sports FC · Página 1</w:t>
     </w:r>
   </w:p>
 </w:ftr>
@@ -753,7 +753,7 @@
     </w:rPrDefault>
     <w:pPrDefault>
       <w:pPr>
-        <w:spacing w:after="160" w:line="259"/>
+        <w:spacing w:after="160" w:line="259" w:lineRule="auto"/>
       </w:pPr>
     </w:pPrDefault>
   </w:docDefaults>

</xml_diff>